<commit_message>
Update Code guide and dictionary (readme).docx
</commit_message>
<xml_diff>
--- a/project-2-pui-applied/code materials/Code guide and dictionary (readme).docx
+++ b/project-2-pui-applied/code materials/Code guide and dictionary (readme).docx
@@ -27,6 +27,7 @@
       <w:r>
         <w:t>This guide explains how to use the code which implemented all the analyses in the manuscript</w:t>
       </w:r>
+      <w:proofErr w:type="gramStart"/>
       <w:r>
         <w:t>:</w:t>
       </w:r>
@@ -34,47 +35,53 @@
         <w:t xml:space="preserve"> </w:t>
       </w:r>
       <w:r>
+        <w:t xml:space="preserve"> ‘</w:t>
+      </w:r>
+      <w:proofErr w:type="gramEnd"/>
+      <w:r>
+        <w:rPr>
+          <w:shd w:val="clear" w:color="auto" w:fill="FFFFFF"/>
+        </w:rPr>
+        <w:t>Predicting cardiovascular risk under intervention: Development and</w:t>
+      </w:r>
+      <w:r>
+        <w:rPr>
+          <w:shd w:val="clear" w:color="auto" w:fill="FFFFFF"/>
+        </w:rPr>
+        <w:t xml:space="preserve"> internal</w:t>
+      </w:r>
+      <w:r>
+        <w:rPr>
+          <w:shd w:val="clear" w:color="auto" w:fill="FFFFFF"/>
+        </w:rPr>
+        <w:t xml:space="preserve"> validation of the CHARIOT Model in 19 million</w:t>
+      </w:r>
+      <w:r>
+        <w:rPr>
+          <w:shd w:val="clear" w:color="auto" w:fill="FFFFFF"/>
+        </w:rPr>
+        <w:t xml:space="preserve"> English</w:t>
+      </w:r>
+      <w:r>
+        <w:rPr>
+          <w:shd w:val="clear" w:color="auto" w:fill="FFFFFF"/>
+        </w:rPr>
         <w:t xml:space="preserve"> </w:t>
       </w:r>
-      <w:r>
-        <w:t>‘</w:t>
-      </w:r>
+      <w:proofErr w:type="gramStart"/>
       <w:r>
         <w:rPr>
           <w:shd w:val="clear" w:color="auto" w:fill="FFFFFF"/>
         </w:rPr>
-        <w:t>Predicting cardiovascular risk under intervention: Development and</w:t>
+        <w:t>adults</w:t>
       </w:r>
       <w:r>
         <w:rPr>
           <w:shd w:val="clear" w:color="auto" w:fill="FFFFFF"/>
         </w:rPr>
-        <w:t xml:space="preserve"> internal</w:t>
-      </w:r>
-      <w:r>
-        <w:rPr>
-          <w:shd w:val="clear" w:color="auto" w:fill="FFFFFF"/>
-        </w:rPr>
-        <w:t xml:space="preserve"> validation of the CHARIOT Model in 19 million</w:t>
-      </w:r>
-      <w:r>
-        <w:rPr>
-          <w:shd w:val="clear" w:color="auto" w:fill="FFFFFF"/>
-        </w:rPr>
-        <w:t xml:space="preserve"> English</w:t>
-      </w:r>
-      <w:r>
-        <w:rPr>
-          <w:shd w:val="clear" w:color="auto" w:fill="FFFFFF"/>
-        </w:rPr>
-        <w:t xml:space="preserve"> adults</w:t>
-      </w:r>
-      <w:r>
-        <w:rPr>
-          <w:shd w:val="clear" w:color="auto" w:fill="FFFFFF"/>
-        </w:rPr>
         <w:t>’</w:t>
       </w:r>
+      <w:proofErr w:type="gramEnd"/>
       <w:r>
         <w:rPr>
           <w:b/>
@@ -140,10 +147,31 @@
         <w:t xml:space="preserve">In order to re-use the code, the working directory should be set to the folder containing the ‘code’ subfolder. This must be set </w:t>
       </w:r>
       <w:r>
-        <w:t xml:space="preserve">using setwd() </w:t>
-      </w:r>
-      <w:r>
-        <w:t xml:space="preserve">at the top of every .R file. </w:t>
+        <w:t xml:space="preserve">using </w:t>
+      </w:r>
+      <w:proofErr w:type="spellStart"/>
+      <w:proofErr w:type="gramStart"/>
+      <w:r>
+        <w:t>setwd</w:t>
+      </w:r>
+      <w:proofErr w:type="spellEnd"/>
+      <w:r>
+        <w:t>(</w:t>
+      </w:r>
+      <w:proofErr w:type="gramEnd"/>
+      <w:r>
+        <w:t xml:space="preserve">) </w:t>
+      </w:r>
+      <w:r>
+        <w:t xml:space="preserve">at the top of </w:t>
+      </w:r>
+      <w:proofErr w:type="gramStart"/>
+      <w:r>
+        <w:t>every .R</w:t>
+      </w:r>
+      <w:proofErr w:type="gramEnd"/>
+      <w:r>
+        <w:t xml:space="preserve"> file. </w:t>
       </w:r>
       <w:r>
         <w:t>We</w:t>
@@ -298,11 +326,6 @@
     </w:p>
     <w:p>
       <w:r>
-        <w:t>risk factors, rather than splitting out the ‘risk estimation’ and ‘intervention’ layers.</w:t>
-      </w:r>
-    </w:p>
-    <w:p>
-      <w:r>
         <w:rPr>
           <w:b/>
           <w:bCs/>
@@ -310,7 +333,15 @@
         <w:t>p7_shiny:</w:t>
       </w:r>
       <w:r>
-        <w:t xml:space="preserve"> code for the rshiny app.</w:t>
+        <w:t xml:space="preserve"> code for the </w:t>
+      </w:r>
+      <w:proofErr w:type="spellStart"/>
+      <w:r>
+        <w:t>rshiny</w:t>
+      </w:r>
+      <w:proofErr w:type="spellEnd"/>
+      <w:r>
+        <w:t xml:space="preserve"> app.</w:t>
       </w:r>
     </w:p>
     <w:p>
@@ -346,8 +377,32 @@
     </w:p>
     <w:p>
       <w:r>
+        <w:t>Within each of these folders</w:t>
+      </w:r>
+      <w:proofErr w:type="gramStart"/>
+      <w:r>
+        <w:t>, .R</w:t>
+      </w:r>
+      <w:proofErr w:type="gramEnd"/>
+      <w:r>
+        <w:t xml:space="preserve"> files are all prefixed with ‘p1’, ‘p2’, …., and are designed to be run in order. Often (but not always), </w:t>
+      </w:r>
+      <w:proofErr w:type="gramStart"/>
+      <w:r>
+        <w:t>subsequent .R</w:t>
+      </w:r>
+      <w:proofErr w:type="gramEnd"/>
+      <w:r>
+        <w:t xml:space="preserve"> files are dependent on objects created in </w:t>
+      </w:r>
+      <w:proofErr w:type="gramStart"/>
+      <w:r>
         <w:lastRenderedPageBreak/>
-        <w:t>Within each of these folders, .R files are all prefixed with ‘p1’, ‘p2’, …., and are designed to be run in order. Often (but not always), subsequent .R files are dependent on objects created in previous .R files.</w:t>
+        <w:t>previous .R</w:t>
+      </w:r>
+      <w:proofErr w:type="gramEnd"/>
+      <w:r>
+        <w:t xml:space="preserve"> files.</w:t>
       </w:r>
       <w:r>
         <w:t xml:space="preserve"> In some folders, some</w:t>
@@ -384,6 +439,7 @@
       </w:r>
     </w:p>
     <w:p>
+      <w:proofErr w:type="gramStart"/>
       <w:r>
         <w:rPr>
           <w:b/>
@@ -392,6 +448,7 @@
         </w:rPr>
         <w:t>TL;DR</w:t>
       </w:r>
+      <w:proofErr w:type="gramEnd"/>
       <w:r>
         <w:t>:</w:t>
       </w:r>
@@ -399,225 +456,26 @@
         <w:t xml:space="preserve"> T</w:t>
       </w:r>
       <w:r>
-        <w:t xml:space="preserve">he code has been written on the assumption that the CPRD Aurum data has already been extracted, formatted into required R .rds objects. The </w:t>
-      </w:r>
-      <w:r>
-        <w:t xml:space="preserve">code is </w:t>
-      </w:r>
-      <w:r>
-        <w:t xml:space="preserve">therefore </w:t>
-      </w:r>
-      <w:r>
-        <w:t>not fully re-usable without some minor edits required, which are detailed here.</w:t>
-      </w:r>
-      <w:r>
-        <w:t xml:space="preserve"> These edits are all required in the data preparation folders (p1_data_prep) and (p2_data_prep_further_mfr).</w:t>
-      </w:r>
-    </w:p>
-    <w:p>
-      <w:pPr>
-        <w:pStyle w:val="Heading2"/>
-      </w:pPr>
-      <w:r>
-        <w:t>Reading in the</w:t>
-      </w:r>
-      <w:r>
-        <w:t xml:space="preserve"> baseline</w:t>
-      </w:r>
-      <w:r>
-        <w:t xml:space="preserve"> cohort file</w:t>
-      </w:r>
-    </w:p>
-    <w:p>
-      <w:r>
-        <w:t>Extraction of the</w:t>
-      </w:r>
-      <w:r>
-        <w:t xml:space="preserve"> CPRD data </w:t>
-      </w:r>
-      <w:r>
-        <w:t>used in</w:t>
-      </w:r>
-      <w:r>
-        <w:t xml:space="preserve"> this project was undertaken to support a number of different analyses. Therefore, the </w:t>
-      </w:r>
-      <w:r>
-        <w:t>data and analysis</w:t>
-      </w:r>
-      <w:r>
-        <w:t xml:space="preserve"> </w:t>
-      </w:r>
-      <w:r>
-        <w:t>cohort</w:t>
-      </w:r>
-      <w:r>
-        <w:t xml:space="preserve"> w</w:t>
-      </w:r>
-      <w:r>
-        <w:t>ere</w:t>
-      </w:r>
-      <w:r>
-        <w:t xml:space="preserve"> extracted and stored in a distinct place from the directory system (</w:t>
-      </w:r>
-      <w:r>
-        <w:t>‘</w:t>
-      </w:r>
-      <w:r>
-        <w:t>code</w:t>
-      </w:r>
-      <w:r>
-        <w:t>’</w:t>
-      </w:r>
-      <w:r>
-        <w:t xml:space="preserve">, </w:t>
-      </w:r>
-      <w:r>
-        <w:t>‘</w:t>
-      </w:r>
-      <w:r>
-        <w:t>data</w:t>
-      </w:r>
-      <w:r>
-        <w:t>’</w:t>
-      </w:r>
-      <w:r>
-        <w:t xml:space="preserve">, </w:t>
-      </w:r>
-      <w:r>
-        <w:t>‘</w:t>
-      </w:r>
-      <w:r>
-        <w:t>figures</w:t>
-      </w:r>
-      <w:r>
-        <w:t>’</w:t>
-      </w:r>
-      <w:r>
-        <w:t xml:space="preserve">, </w:t>
-      </w:r>
-      <w:r>
-        <w:t>‘</w:t>
-      </w:r>
-      <w:r>
-        <w:t>R</w:t>
-      </w:r>
-      <w:r>
-        <w:t>’</w:t>
-      </w:r>
-      <w:r>
-        <w:t>) described above.</w:t>
-      </w:r>
-      <w:r>
-        <w:t xml:space="preserve"> </w:t>
-      </w:r>
-    </w:p>
-    <w:p>
-      <w:r>
-        <w:t>The cohort itself is a</w:t>
-      </w:r>
-      <w:r>
-        <w:t xml:space="preserve"> data.frame, stored as an</w:t>
-      </w:r>
-      <w:r>
-        <w:t xml:space="preserve"> .rds file</w:t>
-      </w:r>
-      <w:r>
-        <w:t>,</w:t>
-      </w:r>
-      <w:r>
-        <w:t xml:space="preserve"> with one row per individual, and one column for each variable.</w:t>
-      </w:r>
-      <w:r>
-        <w:t xml:space="preserve"> This contains information about each individual extracted at their </w:t>
-      </w:r>
-      <w:r>
-        <w:rPr>
-          <w:shd w:val="clear" w:color="auto" w:fill="FFFFFF"/>
-        </w:rPr>
-        <w:t>baseline index date</w:t>
-      </w:r>
-      <w:r>
-        <w:t xml:space="preserve"> </w:t>
-      </w:r>
-      <w:r>
-        <w:t>(</w:t>
-      </w:r>
-      <w:r>
-        <w:rPr>
-          <w:shd w:val="clear" w:color="auto" w:fill="FFFFFF"/>
-        </w:rPr>
-        <w:t>latest of: the start of the study period (1/1/2005), attaining at least one year of registration with a contributing practice to CPRD Aurum, attaining age 18</w:t>
-      </w:r>
-      <w:r>
-        <w:t>)</w:t>
-      </w:r>
-      <w:r>
-        <w:t>.</w:t>
-      </w:r>
-      <w:r>
-        <w:t xml:space="preserve"> </w:t>
-      </w:r>
-      <w:r>
-        <w:t>The structure of the</w:t>
-      </w:r>
-      <w:r>
-        <w:t xml:space="preserve"> </w:t>
-      </w:r>
-      <w:r>
-        <w:t>data.frame</w:t>
-      </w:r>
-      <w:r>
-        <w:t>, including variable names and formats,</w:t>
-      </w:r>
-      <w:r>
-        <w:t xml:space="preserve"> is provided in </w:t>
-      </w:r>
-      <w:r>
-        <w:rPr>
-          <w:i/>
-          <w:iCs/>
-        </w:rPr>
-        <w:t>aaa_cohort_file_structre</w:t>
-      </w:r>
-      <w:r>
-        <w:rPr>
-          <w:i/>
-          <w:iCs/>
-        </w:rPr>
-        <w:t>.txt</w:t>
-      </w:r>
-      <w:r>
-        <w:t xml:space="preserve">. </w:t>
-      </w:r>
-      <w:r>
-        <w:t xml:space="preserve">The exact process for </w:t>
-      </w:r>
-      <w:r>
-        <w:t>the</w:t>
-      </w:r>
-      <w:r>
-        <w:t xml:space="preserve"> data extraction</w:t>
-      </w:r>
-      <w:r>
-        <w:t xml:space="preserve"> used in this study</w:t>
-      </w:r>
-      <w:r>
-        <w:t xml:space="preserve">, and </w:t>
-      </w:r>
-      <w:r>
-        <w:t xml:space="preserve">associated </w:t>
-      </w:r>
-      <w:r>
-        <w:t>code</w:t>
-      </w:r>
-      <w:r>
-        <w:t xml:space="preserve"> is detailed </w:t>
-      </w:r>
-      <w:r>
-        <w:t>in the data extraction GitHub page</w:t>
-      </w:r>
-      <w:r>
-        <w:t>.</w:t>
+        <w:t xml:space="preserve">he code has been written on the assumption that the CPRD </w:t>
+      </w:r>
+      <w:proofErr w:type="spellStart"/>
+      <w:r>
+        <w:t>Aurum</w:t>
+      </w:r>
+      <w:proofErr w:type="spellEnd"/>
+      <w:r>
+        <w:t xml:space="preserve"> data has already been extracted, formatted into required R .</w:t>
+      </w:r>
+      <w:proofErr w:type="spellStart"/>
+      <w:r>
+        <w:t>rds</w:t>
+      </w:r>
+      <w:proofErr w:type="spellEnd"/>
+      <w:r>
+        <w:t xml:space="preserve"> objects. </w:t>
+      </w:r>
+      <w:r>
+        <w:t>See the associated GitHub directory for generic-data-extraction.</w:t>
       </w:r>
       <w:r>
         <w:fldChar w:fldCharType="begin"/>
@@ -642,13 +500,281 @@
         <w:t xml:space="preserve"> </w:t>
       </w:r>
       <w:r>
-        <w:t>The code written to undertake this cohort extraction has been expanded into an R package, rcprd.</w:t>
+        <w:t xml:space="preserve">The </w:t>
+      </w:r>
+      <w:r>
+        <w:t xml:space="preserve">code is </w:t>
+      </w:r>
+      <w:r>
+        <w:t xml:space="preserve">therefore </w:t>
+      </w:r>
+      <w:r>
+        <w:t>not fully re-usable without some minor edits required, which are detailed here.</w:t>
+      </w:r>
+      <w:r>
+        <w:t xml:space="preserve"> These edits are all required in the data preparation folders (p1_data_prep) and (p2_data_prep_further_mfr).</w:t>
+      </w:r>
+    </w:p>
+    <w:p>
+      <w:pPr>
+        <w:pStyle w:val="Heading2"/>
+      </w:pPr>
+      <w:r>
+        <w:t>Reading in the</w:t>
+      </w:r>
+      <w:r>
+        <w:t xml:space="preserve"> baseline</w:t>
+      </w:r>
+      <w:r>
+        <w:t xml:space="preserve"> cohort file</w:t>
+      </w:r>
+    </w:p>
+    <w:p>
+      <w:r>
+        <w:t>Extraction of the</w:t>
+      </w:r>
+      <w:r>
+        <w:t xml:space="preserve"> CPRD data </w:t>
+      </w:r>
+      <w:r>
+        <w:t>used in</w:t>
+      </w:r>
+      <w:r>
+        <w:t xml:space="preserve"> this project was undertaken to support a number of different analyses. Therefore, the </w:t>
+      </w:r>
+      <w:r>
+        <w:t>data and analysis</w:t>
+      </w:r>
+      <w:r>
+        <w:t xml:space="preserve"> </w:t>
+      </w:r>
+      <w:r>
+        <w:t>cohort</w:t>
+      </w:r>
+      <w:r>
+        <w:t xml:space="preserve"> w</w:t>
+      </w:r>
+      <w:r>
+        <w:t>ere</w:t>
+      </w:r>
+      <w:r>
+        <w:t xml:space="preserve"> extracted and stored in a distinct place from the directory system (</w:t>
+      </w:r>
+      <w:r>
+        <w:t>‘</w:t>
+      </w:r>
+      <w:r>
+        <w:t>code</w:t>
+      </w:r>
+      <w:r>
+        <w:t>’</w:t>
+      </w:r>
+      <w:r>
+        <w:t xml:space="preserve">, </w:t>
+      </w:r>
+      <w:r>
+        <w:t>‘</w:t>
+      </w:r>
+      <w:r>
+        <w:t>data</w:t>
+      </w:r>
+      <w:r>
+        <w:t>’</w:t>
+      </w:r>
+      <w:r>
+        <w:t xml:space="preserve">, </w:t>
+      </w:r>
+      <w:r>
+        <w:t>‘</w:t>
+      </w:r>
+      <w:r>
+        <w:t>figures</w:t>
+      </w:r>
+      <w:r>
+        <w:t>’</w:t>
+      </w:r>
+      <w:r>
+        <w:t xml:space="preserve">, </w:t>
+      </w:r>
+      <w:r>
+        <w:t>‘</w:t>
+      </w:r>
+      <w:r>
+        <w:t>R</w:t>
+      </w:r>
+      <w:r>
+        <w:t>’</w:t>
+      </w:r>
+      <w:r>
+        <w:t>) described above.</w:t>
+      </w:r>
+      <w:r>
+        <w:t xml:space="preserve"> </w:t>
+      </w:r>
+    </w:p>
+    <w:p>
+      <w:r>
+        <w:t>The cohort itself is a</w:t>
+      </w:r>
+      <w:r>
+        <w:t xml:space="preserve"> </w:t>
+      </w:r>
+      <w:proofErr w:type="spellStart"/>
+      <w:proofErr w:type="gramStart"/>
+      <w:r>
+        <w:t>data.frame</w:t>
+      </w:r>
+      <w:proofErr w:type="spellEnd"/>
+      <w:proofErr w:type="gramEnd"/>
+      <w:r>
+        <w:t>, stored as an</w:t>
+      </w:r>
+      <w:r>
+        <w:t xml:space="preserve"> .</w:t>
+      </w:r>
+      <w:proofErr w:type="spellStart"/>
+      <w:r>
+        <w:t>rds</w:t>
+      </w:r>
+      <w:proofErr w:type="spellEnd"/>
+      <w:r>
+        <w:t xml:space="preserve"> file</w:t>
+      </w:r>
+      <w:r>
+        <w:t>,</w:t>
+      </w:r>
+      <w:r>
+        <w:t xml:space="preserve"> with one row per individual, and one column for each variable.</w:t>
+      </w:r>
+      <w:r>
+        <w:t xml:space="preserve"> This contains information about each individual extracted at their </w:t>
+      </w:r>
+      <w:r>
+        <w:rPr>
+          <w:shd w:val="clear" w:color="auto" w:fill="FFFFFF"/>
+        </w:rPr>
+        <w:t>baseline index date</w:t>
+      </w:r>
+      <w:r>
+        <w:t xml:space="preserve"> </w:t>
+      </w:r>
+      <w:r>
+        <w:t>(</w:t>
+      </w:r>
+      <w:r>
+        <w:rPr>
+          <w:shd w:val="clear" w:color="auto" w:fill="FFFFFF"/>
+        </w:rPr>
+        <w:t xml:space="preserve">latest </w:t>
+      </w:r>
+      <w:proofErr w:type="gramStart"/>
+      <w:r>
+        <w:rPr>
+          <w:shd w:val="clear" w:color="auto" w:fill="FFFFFF"/>
+        </w:rPr>
+        <w:t>of:</w:t>
+      </w:r>
+      <w:proofErr w:type="gramEnd"/>
+      <w:r>
+        <w:rPr>
+          <w:shd w:val="clear" w:color="auto" w:fill="FFFFFF"/>
+        </w:rPr>
+        <w:t xml:space="preserve"> the start of the study period (1/1/2005), attaining at least one year of registration with a contributing practice to CPRD </w:t>
+      </w:r>
+      <w:proofErr w:type="spellStart"/>
+      <w:r>
+        <w:rPr>
+          <w:shd w:val="clear" w:color="auto" w:fill="FFFFFF"/>
+        </w:rPr>
+        <w:t>Aurum</w:t>
+      </w:r>
+      <w:proofErr w:type="spellEnd"/>
+      <w:r>
+        <w:rPr>
+          <w:shd w:val="clear" w:color="auto" w:fill="FFFFFF"/>
+        </w:rPr>
+        <w:t>, attaining age 18</w:t>
+      </w:r>
+      <w:r>
+        <w:t>)</w:t>
+      </w:r>
+      <w:r>
+        <w:t>.</w:t>
+      </w:r>
+      <w:r>
+        <w:t xml:space="preserve"> </w:t>
+      </w:r>
+      <w:r>
+        <w:t>The structure of the</w:t>
+      </w:r>
+      <w:r>
+        <w:t xml:space="preserve"> </w:t>
+      </w:r>
+      <w:proofErr w:type="spellStart"/>
+      <w:proofErr w:type="gramStart"/>
+      <w:r>
+        <w:t>data.frame</w:t>
+      </w:r>
+      <w:proofErr w:type="spellEnd"/>
+      <w:proofErr w:type="gramEnd"/>
+      <w:r>
+        <w:t>, including variable names and formats,</w:t>
+      </w:r>
+      <w:r>
+        <w:t xml:space="preserve"> is provided in </w:t>
+      </w:r>
+      <w:r>
+        <w:rPr>
+          <w:i/>
+          <w:iCs/>
+        </w:rPr>
+        <w:t>aaa_cohort_file_structre</w:t>
+      </w:r>
+      <w:r>
+        <w:rPr>
+          <w:i/>
+          <w:iCs/>
+        </w:rPr>
+        <w:t>.txt</w:t>
+      </w:r>
+      <w:r>
+        <w:t xml:space="preserve">. </w:t>
+      </w:r>
+      <w:r>
+        <w:t xml:space="preserve">The exact process for </w:t>
+      </w:r>
+      <w:r>
+        <w:t>the</w:t>
+      </w:r>
+      <w:r>
+        <w:t xml:space="preserve"> data extraction</w:t>
+      </w:r>
+      <w:r>
+        <w:t xml:space="preserve"> used in this study</w:t>
+      </w:r>
+      <w:r>
+        <w:t xml:space="preserve">, and </w:t>
+      </w:r>
+      <w:r>
+        <w:t xml:space="preserve">associated </w:t>
+      </w:r>
+      <w:r>
+        <w:t>code</w:t>
+      </w:r>
+      <w:r>
+        <w:t xml:space="preserve"> is detailed </w:t>
+      </w:r>
+      <w:r>
+        <w:t>in the data extraction GitHub page</w:t>
+      </w:r>
+      <w:r>
+        <w:t>.</w:t>
       </w:r>
       <w:r>
         <w:fldChar w:fldCharType="begin"/>
       </w:r>
       <w:r>
-        <w:instrText xml:space="preserve"> ADDIN EN.CITE &lt;EndNote&gt;&lt;Cite&gt;&lt;Author&gt;Pate&lt;/Author&gt;&lt;Year&gt;2025&lt;/Year&gt;&lt;RecNum&gt;1520&lt;/RecNum&gt;&lt;DisplayText&gt;&lt;style face="superscript"&gt;2&lt;/style&gt;&lt;/DisplayText&gt;&lt;record&gt;&lt;rec-number&gt;1520&lt;/rec-number&gt;&lt;foreign-keys&gt;&lt;key app="EN" db-id="twswaaew0fpxr5e00pu5ezsdrzsd2w5s5tst" timestamp="1771503794"&gt;1520&lt;/key&gt;&lt;/foreign-keys&gt;&lt;ref-type name="Journal Article"&gt;17&lt;/ref-type&gt;&lt;contributors&gt;&lt;authors&gt;&lt;author&gt;Pate, Alexander&lt;/author&gt;&lt;author&gt;Parisi, Rosa&lt;/author&gt;&lt;author&gt;Kontopantelis, Evangelos&lt;/author&gt;&lt;author&gt;Sperrin, Matthew&lt;/author&gt;&lt;/authors&gt;&lt;/contributors&gt;&lt;titles&gt;&lt;title&gt;rcprd: An R package to simplify the extraction and processing of Clinical Practice Research Datalink (CPRD) data, and create analysis-ready datasets&lt;/title&gt;&lt;secondary-title&gt;Plos One&lt;/secondary-title&gt;&lt;/titles&gt;&lt;periodical&gt;&lt;full-title&gt;PLoS ONE&lt;/full-title&gt;&lt;/periodical&gt;&lt;pages&gt;1-25&lt;/pages&gt;&lt;volume&gt;20&lt;/volume&gt;&lt;number&gt;8 August&lt;/number&gt;&lt;dates&gt;&lt;year&gt;2025&lt;/year&gt;&lt;/dates&gt;&lt;urls&gt;&lt;related-urls&gt;&lt;url&gt;https://doi.org/10.1371/journal.pone.0327229&lt;/url&gt;&lt;/related-urls&gt;&lt;/urls&gt;&lt;electronic-resource-num&gt;10.1371/journal.pone.0327229&lt;/electronic-resource-num&gt;&lt;/record&gt;&lt;/Cite&gt;&lt;/EndNote&gt;</w:instrText>
+        <w:instrText xml:space="preserve"> ADDIN EN.CITE &lt;EndNote&gt;&lt;Cite&gt;&lt;Author&gt;Pate&lt;/Author&gt;&lt;Year&gt;2025&lt;/Year&gt;&lt;RecNum&gt;1494&lt;/RecNum&gt;&lt;DisplayText&gt;&lt;style face="superscript"&gt;1&lt;/style&gt;&lt;/DisplayText&gt;&lt;record&gt;&lt;rec-number&gt;1494&lt;/rec-number&gt;&lt;foreign-keys&gt;&lt;key app="EN" db-id="twswaaew0fpxr5e00pu5ezsdrzsd2w5s5tst" timestamp="1771503794"&gt;1494&lt;/key&gt;&lt;/foreign-keys&gt;&lt;ref-type name="Generic"&gt;13&lt;/ref-type&gt;&lt;contributors&gt;&lt;authors&gt;&lt;author&gt;Pate, Alexander&lt;/author&gt;&lt;/authors&gt;&lt;/contributors&gt;&lt;titles&gt;&lt;title&gt;GitHub repository. Manchester Predictive Healthcare Group. CHI-CHARIOT-generic-data-extraction&lt;/title&gt;&lt;/titles&gt;&lt;dates&gt;&lt;year&gt;2025&lt;/year&gt;&lt;/dates&gt;&lt;urls&gt;&lt;related-urls&gt;&lt;url&gt;https://github.com/manchester-predictive-healthcare-group/CHI-CHARIOT/tree/main/generic-data-extraction&lt;/url&gt;&lt;/related-urls&gt;&lt;/urls&gt;&lt;/record&gt;&lt;/Cite&gt;&lt;/EndNote&gt;</w:instrText>
       </w:r>
       <w:r>
         <w:fldChar w:fldCharType="separate"/>
@@ -658,61 +784,16 @@
           <w:noProof/>
           <w:vertAlign w:val="superscript"/>
         </w:rPr>
-        <w:t>2</w:t>
+        <w:t>1</w:t>
       </w:r>
       <w:r>
         <w:fldChar w:fldCharType="end"/>
       </w:r>
-    </w:p>
-    <w:p>
-      <w:r>
-        <w:t xml:space="preserve">This cohort must be read in and saved into the </w:t>
-      </w:r>
-      <w:r>
-        <w:t>workspace within which all this code operates. Specifically</w:t>
-      </w:r>
-      <w:r>
-        <w:t>, in the file: ‘</w:t>
-      </w:r>
-      <w:r>
-        <w:rPr>
-          <w:i/>
-          <w:iCs/>
-        </w:rPr>
-        <w:t>p1_data_prep/p2_create_cohort.R’</w:t>
-      </w:r>
-      <w:r>
-        <w:t xml:space="preserve">, </w:t>
-      </w:r>
-      <w:r>
-        <w:t xml:space="preserve">at </w:t>
-      </w:r>
-      <w:r>
-        <w:t xml:space="preserve">line 21, the </w:t>
-      </w:r>
-      <w:r>
-        <w:t>‘</w:t>
-      </w:r>
-      <w:r>
-        <w:rPr>
-          <w:i/>
-          <w:iCs/>
-        </w:rPr>
-        <w:t>readRDS()</w:t>
-      </w:r>
-      <w:r>
-        <w:t>’</w:t>
-      </w:r>
-      <w:r>
-        <w:t xml:space="preserve"> command should be changed to read in the cohort file from wherever it is stored</w:t>
-      </w:r>
-    </w:p>
-    <w:p>
-      <w:r>
-        <w:t>Also note, t</w:t>
-      </w:r>
-      <w:r>
-        <w:t>he file: ‘p1_data_prep/p1_extract_variable_components.R’ extracts the components of composite variables (e.g. BMI, Non-HDL cholesterol, etc). This was done for exploratory reasons and is not required for the fitting of this model. It also requires querying an SQLite database (see rcprd</w:t>
+      <w:r>
+        <w:t xml:space="preserve"> </w:t>
+      </w:r>
+      <w:r>
+        <w:t>The code written to undertake this cohort extraction has been expanded into an R package, rcprd.</w:t>
       </w:r>
       <w:r>
         <w:fldChar w:fldCharType="begin"/>
@@ -733,20 +814,104 @@
       <w:r>
         <w:fldChar w:fldCharType="end"/>
       </w:r>
-      <w:r>
-        <w:t xml:space="preserve"> </w:t>
-      </w:r>
-      <w:r>
-        <w:t xml:space="preserve">and </w:t>
-      </w:r>
-      <w:r>
-        <w:t>the data extraction GitHub page</w:t>
-      </w:r>
-      <w:r>
-        <w:fldChar w:fldCharType="begin" w:fldLock="1"/>
-      </w:r>
-      <w:r>
-        <w:instrText>ADDIN CSL_CITATION {"citationItems":[{"id":"ITEM-1","itemData":{"URL":"https://github.com/manchester-predictive-healthcare-group/CHI-CHARIOT/tree/main/generic-data-extraction","accessed":{"date-parts":[["2025","7","10"]]},"author":[{"dropping-particle":"","family":"Pate","given":"Alexander","non-dropping-particle":"","parse-names":false,"suffix":""}],"id":"ITEM-1","issued":{"date-parts":[["0"]]},"title":"GitHub repository. Manchester Predictive Healthcare Group. CHI-CHARIOT-generic-data-extraction.","type":"webpage"},"uris":["http://www.mendeley.com/documents/?uuid=94789562-f0c7-4b9d-99a6-05d4ada981bd"]}],"mendeley":{"formattedCitation":"&lt;sup&gt;1&lt;/sup&gt;","plainTextFormattedCitation":"1","previouslyFormattedCitation":"&lt;sup&gt;1&lt;/sup&gt;"},"properties":{"noteIndex":0},"schema":"https://github.com/citation-style-language/schema/raw/master/csl-citation.json"}</w:instrText>
+    </w:p>
+    <w:p>
+      <w:r>
+        <w:t xml:space="preserve">This cohort must be read in and saved into the </w:t>
+      </w:r>
+      <w:r>
+        <w:t>workspace within which all this code operates. Specifically</w:t>
+      </w:r>
+      <w:r>
+        <w:t>, in the file: ‘</w:t>
+      </w:r>
+      <w:r>
+        <w:rPr>
+          <w:i/>
+          <w:iCs/>
+        </w:rPr>
+        <w:t>p1_data_prep/p2_create_</w:t>
+      </w:r>
+      <w:proofErr w:type="gramStart"/>
+      <w:r>
+        <w:rPr>
+          <w:i/>
+          <w:iCs/>
+        </w:rPr>
+        <w:t>cohort.R</w:t>
+      </w:r>
+      <w:proofErr w:type="gramEnd"/>
+      <w:r>
+        <w:rPr>
+          <w:i/>
+          <w:iCs/>
+        </w:rPr>
+        <w:t>’</w:t>
+      </w:r>
+      <w:r>
+        <w:t xml:space="preserve">, </w:t>
+      </w:r>
+      <w:r>
+        <w:t xml:space="preserve">at </w:t>
+      </w:r>
+      <w:r>
+        <w:t xml:space="preserve">line 21, the </w:t>
+      </w:r>
+      <w:r>
+        <w:t>‘</w:t>
+      </w:r>
+      <w:proofErr w:type="spellStart"/>
+      <w:proofErr w:type="gramStart"/>
+      <w:r>
+        <w:rPr>
+          <w:i/>
+          <w:iCs/>
+        </w:rPr>
+        <w:t>readRDS</w:t>
+      </w:r>
+      <w:proofErr w:type="spellEnd"/>
+      <w:r>
+        <w:rPr>
+          <w:i/>
+          <w:iCs/>
+        </w:rPr>
+        <w:t>(</w:t>
+      </w:r>
+      <w:proofErr w:type="gramEnd"/>
+      <w:r>
+        <w:rPr>
+          <w:i/>
+          <w:iCs/>
+        </w:rPr>
+        <w:t>)</w:t>
+      </w:r>
+      <w:r>
+        <w:t>’</w:t>
+      </w:r>
+      <w:r>
+        <w:t xml:space="preserve"> command should be changed to read in the cohort file from wherever it is stored</w:t>
+      </w:r>
+    </w:p>
+    <w:p>
+      <w:r>
+        <w:t>Also note, t</w:t>
+      </w:r>
+      <w:r>
+        <w:t>he file: ‘p1_data_prep/p1_extract_variable_</w:t>
+      </w:r>
+      <w:proofErr w:type="gramStart"/>
+      <w:r>
+        <w:t>components.R</w:t>
+      </w:r>
+      <w:proofErr w:type="gramEnd"/>
+      <w:r>
+        <w:t>’ extracts the components of composite variables (e.g. BMI, Non-HDL cholesterol, etc). This was done for exploratory reasons and is not required for the fitting of this model. It also requires querying an SQLite database (see rcprd</w:t>
+      </w:r>
+      <w:r>
+        <w:fldChar w:fldCharType="begin"/>
+      </w:r>
+      <w:r>
+        <w:instrText xml:space="preserve"> ADDIN EN.CITE &lt;EndNote&gt;&lt;Cite&gt;&lt;Author&gt;Pate&lt;/Author&gt;&lt;Year&gt;2025&lt;/Year&gt;&lt;RecNum&gt;1520&lt;/RecNum&gt;&lt;DisplayText&gt;&lt;style face="superscript"&gt;2&lt;/style&gt;&lt;/DisplayText&gt;&lt;record&gt;&lt;rec-number&gt;1520&lt;/rec-number&gt;&lt;foreign-keys&gt;&lt;key app="EN" db-id="twswaaew0fpxr5e00pu5ezsdrzsd2w5s5tst" timestamp="1771503794"&gt;1520&lt;/key&gt;&lt;/foreign-keys&gt;&lt;ref-type name="Journal Article"&gt;17&lt;/ref-type&gt;&lt;contributors&gt;&lt;authors&gt;&lt;author&gt;Pate, Alexander&lt;/author&gt;&lt;author&gt;Parisi, Rosa&lt;/author&gt;&lt;author&gt;Kontopantelis, Evangelos&lt;/author&gt;&lt;author&gt;Sperrin, Matthew&lt;/author&gt;&lt;/authors&gt;&lt;/contributors&gt;&lt;titles&gt;&lt;title&gt;rcprd: An R package to simplify the extraction and processing of Clinical Practice Research Datalink (CPRD) data, and create analysis-ready datasets&lt;/title&gt;&lt;secondary-title&gt;Plos One&lt;/secondary-title&gt;&lt;/titles&gt;&lt;periodical&gt;&lt;full-title&gt;PLoS ONE&lt;/full-title&gt;&lt;/periodical&gt;&lt;pages&gt;1-25&lt;/pages&gt;&lt;volume&gt;20&lt;/volume&gt;&lt;number&gt;8 August&lt;/number&gt;&lt;dates&gt;&lt;year&gt;2025&lt;/year&gt;&lt;/dates&gt;&lt;urls&gt;&lt;related-urls&gt;&lt;url&gt;https://doi.org/10.1371/journal.pone.0327229&lt;/url&gt;&lt;/related-urls&gt;&lt;/urls&gt;&lt;electronic-resource-num&gt;10.1371/journal.pone.0327229&lt;/electronic-resource-num&gt;&lt;/record&gt;&lt;/Cite&gt;&lt;/EndNote&gt;</w:instrText>
       </w:r>
       <w:r>
         <w:fldChar w:fldCharType="separate"/>
@@ -756,6 +921,34 @@
           <w:noProof/>
           <w:vertAlign w:val="superscript"/>
         </w:rPr>
+        <w:t>2</w:t>
+      </w:r>
+      <w:r>
+        <w:fldChar w:fldCharType="end"/>
+      </w:r>
+      <w:r>
+        <w:t xml:space="preserve"> </w:t>
+      </w:r>
+      <w:r>
+        <w:t xml:space="preserve">and </w:t>
+      </w:r>
+      <w:r>
+        <w:t>the data extraction GitHub page</w:t>
+      </w:r>
+      <w:r>
+        <w:fldChar w:fldCharType="begin" w:fldLock="1"/>
+      </w:r>
+      <w:r>
+        <w:instrText>ADDIN CSL_CITATION {"citationItems":[{"id":"ITEM-1","itemData":{"URL":"https://github.com/manchester-predictive-healthcare-group/CHI-CHARIOT/tree/main/generic-data-extraction","accessed":{"date-parts":[["2025","7","10"]]},"author":[{"dropping-particle":"","family":"Pate","given":"Alexander","non-dropping-particle":"","parse-names":false,"suffix":""}],"id":"ITEM-1","issued":{"date-parts":[["0"]]},"title":"GitHub repository. Manchester Predictive Healthcare Group. CHI-CHARIOT-generic-data-extraction.","type":"webpage"},"uris":["http://www.mendeley.com/documents/?uuid=94789562-f0c7-4b9d-99a6-05d4ada981bd"]}],"mendeley":{"formattedCitation":"&lt;sup&gt;1&lt;/sup&gt;","plainTextFormattedCitation":"1","previouslyFormattedCitation":"&lt;sup&gt;1&lt;/sup&gt;"},"properties":{"noteIndex":0},"schema":"https://github.com/citation-style-language/schema/raw/master/csl-citation.json"}</w:instrText>
+      </w:r>
+      <w:r>
+        <w:fldChar w:fldCharType="separate"/>
+      </w:r>
+      <w:r>
+        <w:rPr>
+          <w:noProof/>
+          <w:vertAlign w:val="superscript"/>
+        </w:rPr>
         <w:t>1</w:t>
       </w:r>
       <w:r>
@@ -772,8 +965,17 @@
           <w:i/>
           <w:iCs/>
         </w:rPr>
-        <w:t>p1_data_prep/p2_create_cohort.R</w:t>
-      </w:r>
+        <w:t>p1_data_prep/p2_create_</w:t>
+      </w:r>
+      <w:proofErr w:type="gramStart"/>
+      <w:r>
+        <w:rPr>
+          <w:i/>
+          <w:iCs/>
+        </w:rPr>
+        <w:t>cohort.R</w:t>
+      </w:r>
+      <w:proofErr w:type="gramEnd"/>
       <w:r>
         <w:rPr>
           <w:i/>
@@ -798,7 +1000,15 @@
           <w:i/>
           <w:iCs/>
         </w:rPr>
-        <w:t>p1_data_prep/p2_create_cohort.R</w:t>
+        <w:t>p1_data_prep/p2_create_</w:t>
+      </w:r>
+      <w:proofErr w:type="gramStart"/>
+      <w:r>
+        <w:rPr>
+          <w:i/>
+          <w:iCs/>
+        </w:rPr>
+        <w:t>cohort.R</w:t>
       </w:r>
       <w:r>
         <w:rPr>
@@ -811,7 +1021,11 @@
         <w:t xml:space="preserve"> </w:t>
       </w:r>
       <w:r>
-        <w:t>the code</w:t>
+        <w:t>the</w:t>
+      </w:r>
+      <w:proofErr w:type="gramEnd"/>
+      <w:r>
+        <w:t xml:space="preserve"> code</w:t>
       </w:r>
       <w:r>
         <w:t xml:space="preserve"> which reads in the variable components and merges it with the cohort (i.e. </w:t>
@@ -882,79 +1096,79 @@
     </w:p>
     <w:p>
       <w:r>
+        <w:t>‘</w:t>
+      </w:r>
+      <w:r>
+        <w:rPr>
+          <w:i/>
+          <w:iCs/>
+        </w:rPr>
+        <w:t>p5_validate_temporal/</w:t>
+      </w:r>
+      <w:r>
+        <w:rPr>
+          <w:i/>
+          <w:iCs/>
+        </w:rPr>
+        <w:t>p1.1_temporalv_combine_cohorts.R</w:t>
+      </w:r>
+      <w:r>
+        <w:t>’</w:t>
+      </w:r>
+      <w:r>
+        <w:t xml:space="preserve"> (line 26)</w:t>
+      </w:r>
+      <w:r>
+        <w:t xml:space="preserve"> </w:t>
+      </w:r>
+      <w:r>
+        <w:t>‘</w:t>
+      </w:r>
+      <w:r>
+        <w:rPr>
+          <w:i/>
+          <w:iCs/>
+        </w:rPr>
+        <w:t>p5_validate_temporal/p</w:t>
+      </w:r>
+      <w:r>
+        <w:rPr>
+          <w:i/>
+          <w:iCs/>
+        </w:rPr>
+        <w:t>1.</w:t>
+      </w:r>
+      <w:r>
+        <w:rPr>
+          <w:i/>
+          <w:iCs/>
+        </w:rPr>
+        <w:t>2_temporalv_</w:t>
+      </w:r>
+      <w:r>
+        <w:rPr>
+          <w:i/>
+          <w:iCs/>
+        </w:rPr>
+        <w:t>create_individual_cohorts</w:t>
+      </w:r>
+      <w:r>
+        <w:rPr>
+          <w:i/>
+          <w:iCs/>
+        </w:rPr>
+        <w:t>.R</w:t>
+      </w:r>
+      <w:r>
+        <w:t>’</w:t>
+      </w:r>
+      <w:r>
+        <w:t xml:space="preserve"> (line 70)</w:t>
+      </w:r>
+    </w:p>
+    <w:p>
+      <w:r>
         <w:lastRenderedPageBreak/>
-        <w:t>‘</w:t>
-      </w:r>
-      <w:r>
-        <w:rPr>
-          <w:i/>
-          <w:iCs/>
-        </w:rPr>
-        <w:t>p5_validate_temporal/</w:t>
-      </w:r>
-      <w:r>
-        <w:rPr>
-          <w:i/>
-          <w:iCs/>
-        </w:rPr>
-        <w:t>p1.1_temporalv_combine_cohorts.R</w:t>
-      </w:r>
-      <w:r>
-        <w:t>’</w:t>
-      </w:r>
-      <w:r>
-        <w:t xml:space="preserve"> (line 26)</w:t>
-      </w:r>
-      <w:r>
-        <w:t xml:space="preserve"> </w:t>
-      </w:r>
-      <w:r>
-        <w:t>‘</w:t>
-      </w:r>
-      <w:r>
-        <w:rPr>
-          <w:i/>
-          <w:iCs/>
-        </w:rPr>
-        <w:t>p5_validate_temporal/p</w:t>
-      </w:r>
-      <w:r>
-        <w:rPr>
-          <w:i/>
-          <w:iCs/>
-        </w:rPr>
-        <w:t>1.</w:t>
-      </w:r>
-      <w:r>
-        <w:rPr>
-          <w:i/>
-          <w:iCs/>
-        </w:rPr>
-        <w:t>2_temporalv_</w:t>
-      </w:r>
-      <w:r>
-        <w:rPr>
-          <w:i/>
-          <w:iCs/>
-        </w:rPr>
-        <w:t>create_individual_cohorts</w:t>
-      </w:r>
-      <w:r>
-        <w:rPr>
-          <w:i/>
-          <w:iCs/>
-        </w:rPr>
-        <w:t>.R</w:t>
-      </w:r>
-      <w:r>
-        <w:t>’</w:t>
-      </w:r>
-      <w:r>
-        <w:t xml:space="preserve"> (line 70)</w:t>
-      </w:r>
-    </w:p>
-    <w:p>
-      <w:r>
         <w:t xml:space="preserve">The exact process for the data extraction used in this study, and associated code, is detailed in </w:t>
       </w:r>
       <w:r>
@@ -1033,7 +1247,15 @@
         <w:t xml:space="preserve"> changes in smoking status, statin use and antihypertensive use during an individual’s follow-up. </w:t>
       </w:r>
       <w:r>
-        <w:t xml:space="preserve">We also wanted to extract systolic blood pressure, body mass index and Non-HDL cholesterol during follow-up, to validate the interventional part of the model. </w:t>
+        <w:t xml:space="preserve">We also wanted to extract systolic blood pressure, body mass index and </w:t>
+      </w:r>
+      <w:proofErr w:type="gramStart"/>
+      <w:r>
+        <w:t>Non-HDL</w:t>
+      </w:r>
+      <w:proofErr w:type="gramEnd"/>
+      <w:r>
+        <w:t xml:space="preserve"> cholesterol during follow-up, to validate the interventional part of the model. </w:t>
       </w:r>
       <w:r>
         <w:t>This required some extra data extraction on top of the cohort described in section 3.1 of this guide.</w:t>
@@ -1149,7 +1371,15 @@
     </w:p>
     <w:p>
       <w:r>
-        <w:t xml:space="preserve">The database queries are then saved as .rds files for easier access. Based off these queries, the </w:t>
+        <w:t>The database queries are then saved as .</w:t>
+      </w:r>
+      <w:proofErr w:type="spellStart"/>
+      <w:r>
+        <w:t>rds</w:t>
+      </w:r>
+      <w:proofErr w:type="spellEnd"/>
+      <w:r>
+        <w:t xml:space="preserve"> files for easier access. Based off these queries, the </w:t>
       </w:r>
       <w:r>
         <w:t>split survival</w:t>
@@ -1271,8 +1501,26 @@
           <w:i/>
           <w:iCs/>
         </w:rPr>
-        <w:t>p2_data_prep_further_mfr/3.2B_combine_ prescriptions_followup_for_model.R</w:t>
-      </w:r>
+        <w:t xml:space="preserve">p2_data_prep_further_mfr/3.2B_combine_ </w:t>
+      </w:r>
+      <w:proofErr w:type="spellStart"/>
+      <w:r>
+        <w:rPr>
+          <w:i/>
+          <w:iCs/>
+        </w:rPr>
+        <w:t>prescriptions_followup_for_</w:t>
+      </w:r>
+      <w:proofErr w:type="gramStart"/>
+      <w:r>
+        <w:rPr>
+          <w:i/>
+          <w:iCs/>
+        </w:rPr>
+        <w:t>model.R</w:t>
+      </w:r>
+      <w:proofErr w:type="spellEnd"/>
+      <w:proofErr w:type="gramEnd"/>
       <w:r>
         <w:rPr>
           <w:i/>
@@ -1300,8 +1548,26 @@
           <w:i/>
           <w:iCs/>
         </w:rPr>
-        <w:t>p2_data_prep_further_mfr/3.2C_augment_ prescriptions_followup_for_model.R</w:t>
-      </w:r>
+        <w:t xml:space="preserve">p2_data_prep_further_mfr/3.2C_augment_ </w:t>
+      </w:r>
+      <w:proofErr w:type="spellStart"/>
+      <w:r>
+        <w:rPr>
+          <w:i/>
+          <w:iCs/>
+        </w:rPr>
+        <w:t>prescriptions_followup_for_</w:t>
+      </w:r>
+      <w:proofErr w:type="gramStart"/>
+      <w:r>
+        <w:rPr>
+          <w:i/>
+          <w:iCs/>
+        </w:rPr>
+        <w:t>model.R</w:t>
+      </w:r>
+      <w:proofErr w:type="spellEnd"/>
+      <w:proofErr w:type="gramEnd"/>
       <w:r>
         <w:rPr>
           <w:i/>
@@ -1368,15 +1634,15 @@
     </w:p>
     <w:p>
       <w:r>
+        <w:t>p1_data_prep/p4_impute_cohort_prototype3.R</w:t>
+      </w:r>
+      <w:r>
+        <w:t xml:space="preserve"> (parallelisation over task ID 1 - 10, and male/female).</w:t>
+      </w:r>
+    </w:p>
+    <w:p>
+      <w:r>
         <w:lastRenderedPageBreak/>
-        <w:t>p1_data_prep/p4_impute_cohort_prototype3.R</w:t>
-      </w:r>
-      <w:r>
-        <w:t xml:space="preserve"> (parallelisation over task ID 1 - 10, and male/female).</w:t>
-      </w:r>
-    </w:p>
-    <w:p>
-      <w:r>
         <w:t>p2_data_prep_further_mfr/p3.1A_extract_smoking_followup_for_model.R</w:t>
       </w:r>
       <w:r>
@@ -1417,8 +1683,13 @@
         <w:t>/p</w:t>
       </w:r>
       <w:r>
-        <w:t>2_optimism_loop.R</w:t>
-      </w:r>
+        <w:t>2_optimism_</w:t>
+      </w:r>
+      <w:proofErr w:type="gramStart"/>
+      <w:r>
+        <w:t>loop.R</w:t>
+      </w:r>
+      <w:proofErr w:type="gramEnd"/>
       <w:r>
         <w:t xml:space="preserve"> (parallelisation over task ID 1 – </w:t>
       </w:r>
@@ -1430,6 +1701,23 @@
       </w:r>
     </w:p>
     <w:p/>
+    <w:p>
+      <w:pPr>
+        <w:rPr>
+          <w:b/>
+          <w:bCs/>
+          <w:u w:val="single"/>
+        </w:rPr>
+      </w:pPr>
+      <w:r>
+        <w:rPr>
+          <w:b/>
+          <w:bCs/>
+          <w:u w:val="single"/>
+        </w:rPr>
+        <w:t>References</w:t>
+      </w:r>
+    </w:p>
     <w:p>
       <w:pPr>
         <w:pStyle w:val="EndNoteBibliography"/>

</xml_diff>